<commit_message>
Simple Linear Regression Notes Updated
</commit_message>
<xml_diff>
--- a/Machine Learning/ML Notes.docx
+++ b/Machine Learning/ML Notes.docx
@@ -12,6 +12,12 @@
         <w:rPr>
           <w:lang w:val="en-US"/>
         </w:rPr>
+        <w:t xml:space="preserve"> </w:t>
+      </w:r>
+      <w:r>
+        <w:rPr>
+          <w:lang w:val="en-US"/>
+        </w:rPr>
         <w:t>Sree Rama</w:t>
       </w:r>
     </w:p>
@@ -25,14 +31,7 @@
         <w:rPr>
           <w:lang w:val="en-US"/>
         </w:rPr>
-        <w:t xml:space="preserve">Data Scientist is used in </w:t>
-      </w:r>
-      <w:proofErr w:type="gramStart"/>
-      <w:r>
-        <w:rPr>
-          <w:lang w:val="en-US"/>
-        </w:rPr>
-        <w:t>AI</w:t>
+        <w:t>Data Scientist is used in AI</w:t>
       </w:r>
       <w:r>
         <w:rPr>
@@ -44,14 +43,7 @@
         <w:rPr>
           <w:lang w:val="en-US"/>
         </w:rPr>
-        <w:t>ML</w:t>
-      </w:r>
-      <w:proofErr w:type="gramEnd"/>
-      <w:r>
-        <w:rPr>
-          <w:lang w:val="en-US"/>
-        </w:rPr>
-        <w:t>,DL</w:t>
+        <w:t>ML,DL</w:t>
       </w:r>
     </w:p>
     <w:p>
@@ -60,19 +52,11 @@
           <w:lang w:val="en-US"/>
         </w:rPr>
       </w:pPr>
-      <w:proofErr w:type="gramStart"/>
-      <w:r>
-        <w:rPr>
-          <w:lang w:val="en-US"/>
-        </w:rPr>
-        <w:t>AI :</w:t>
-      </w:r>
-      <w:proofErr w:type="gramEnd"/>
-      <w:r>
-        <w:rPr>
-          <w:lang w:val="en-US"/>
-        </w:rPr>
-        <w:t xml:space="preserve"> </w:t>
+      <w:r>
+        <w:rPr>
+          <w:lang w:val="en-US"/>
+        </w:rPr>
+        <w:t xml:space="preserve">AI : </w:t>
       </w:r>
     </w:p>
     <w:p>
@@ -81,7 +65,6 @@
           <w:lang w:val="en-US"/>
         </w:rPr>
       </w:pPr>
-      <w:proofErr w:type="gramStart"/>
       <w:r>
         <w:rPr>
           <w:lang w:val="en-US"/>
@@ -92,42 +75,13 @@
         <w:rPr>
           <w:lang w:val="en-US"/>
         </w:rPr>
-        <w:t xml:space="preserve"> :</w:t>
-      </w:r>
-      <w:proofErr w:type="gramEnd"/>
-      <w:r>
-        <w:rPr>
-          <w:lang w:val="en-US"/>
-        </w:rPr>
-        <w:t xml:space="preserve"> </w:t>
-      </w:r>
-      <w:r>
-        <w:rPr>
-          <w:lang w:val="en-US"/>
-        </w:rPr>
-        <w:t xml:space="preserve"> give stats tool to </w:t>
-      </w:r>
-      <w:proofErr w:type="gramStart"/>
-      <w:r>
-        <w:rPr>
-          <w:lang w:val="en-US"/>
-        </w:rPr>
-        <w:t>analyze ,</w:t>
-      </w:r>
-      <w:proofErr w:type="spellStart"/>
-      <w:r>
-        <w:rPr>
-          <w:lang w:val="en-US"/>
-        </w:rPr>
-        <w:t>forecasr</w:t>
-      </w:r>
-      <w:proofErr w:type="spellEnd"/>
-      <w:proofErr w:type="gramEnd"/>
-      <w:r>
-        <w:rPr>
-          <w:lang w:val="en-US"/>
-        </w:rPr>
-        <w:t xml:space="preserve"> and predict data</w:t>
+        <w:t xml:space="preserve"> : </w:t>
+      </w:r>
+      <w:r>
+        <w:rPr>
+          <w:lang w:val="en-US"/>
+        </w:rPr>
+        <w:t xml:space="preserve"> give stats tool to analyze ,forecasr and predict data</w:t>
       </w:r>
     </w:p>
     <w:p>
@@ -140,21 +94,7 @@
         <w:rPr>
           <w:lang w:val="en-US"/>
         </w:rPr>
-        <w:t xml:space="preserve">Deep Learning is </w:t>
-      </w:r>
-      <w:proofErr w:type="gramStart"/>
-      <w:r>
-        <w:rPr>
-          <w:lang w:val="en-US"/>
-        </w:rPr>
-        <w:t>subset</w:t>
-      </w:r>
-      <w:proofErr w:type="gramEnd"/>
-      <w:r>
-        <w:rPr>
-          <w:lang w:val="en-US"/>
-        </w:rPr>
-        <w:t xml:space="preserve"> of ML</w:t>
+        <w:t>Deep Learning is subset of ML</w:t>
       </w:r>
     </w:p>
     <w:p>
@@ -187,33 +127,11 @@
           <w:lang w:val="en-US"/>
         </w:rPr>
       </w:pPr>
-      <w:proofErr w:type="gramStart"/>
-      <w:r>
-        <w:rPr>
-          <w:lang w:val="en-US"/>
-        </w:rPr>
-        <w:t>SL :</w:t>
-      </w:r>
-      <w:proofErr w:type="gramEnd"/>
-      <w:r>
-        <w:rPr>
-          <w:lang w:val="en-US"/>
-        </w:rPr>
-        <w:t xml:space="preserve"> Dependent </w:t>
-      </w:r>
-      <w:proofErr w:type="gramStart"/>
-      <w:r>
-        <w:rPr>
-          <w:lang w:val="en-US"/>
-        </w:rPr>
-        <w:t>Feature  is</w:t>
-      </w:r>
-      <w:proofErr w:type="gramEnd"/>
-      <w:r>
-        <w:rPr>
-          <w:lang w:val="en-US"/>
-        </w:rPr>
-        <w:t xml:space="preserve"> predicted withs et of independent features</w:t>
+      <w:r>
+        <w:rPr>
+          <w:lang w:val="en-US"/>
+        </w:rPr>
+        <w:t>SL : Dependent Feature  is predicted withs et of independent features</w:t>
       </w:r>
     </w:p>
     <w:p>
@@ -222,19 +140,11 @@
           <w:lang w:val="en-US"/>
         </w:rPr>
       </w:pPr>
-      <w:proofErr w:type="gramStart"/>
-      <w:r>
-        <w:rPr>
-          <w:lang w:val="en-US"/>
-        </w:rPr>
-        <w:t>UL :</w:t>
-      </w:r>
-      <w:proofErr w:type="gramEnd"/>
-      <w:r>
-        <w:rPr>
-          <w:lang w:val="en-US"/>
-        </w:rPr>
-        <w:t xml:space="preserve"> Clustering Algos</w:t>
+      <w:r>
+        <w:rPr>
+          <w:lang w:val="en-US"/>
+        </w:rPr>
+        <w:t>UL : Clustering Algos</w:t>
       </w:r>
     </w:p>
     <w:p>
@@ -243,19 +153,11 @@
           <w:lang w:val="en-US"/>
         </w:rPr>
       </w:pPr>
-      <w:proofErr w:type="gramStart"/>
-      <w:r>
-        <w:rPr>
-          <w:lang w:val="en-US"/>
-        </w:rPr>
-        <w:t>Classification :</w:t>
-      </w:r>
-      <w:proofErr w:type="gramEnd"/>
-      <w:r>
-        <w:rPr>
-          <w:lang w:val="en-US"/>
-        </w:rPr>
-        <w:t xml:space="preserve"> Its Binary class</w:t>
+      <w:r>
+        <w:rPr>
+          <w:lang w:val="en-US"/>
+        </w:rPr>
+        <w:t>Classification : Its Binary class</w:t>
       </w:r>
     </w:p>
     <w:p>
@@ -264,33 +166,11 @@
           <w:lang w:val="en-US"/>
         </w:rPr>
       </w:pPr>
-      <w:proofErr w:type="gramStart"/>
-      <w:r>
-        <w:rPr>
-          <w:lang w:val="en-US"/>
-        </w:rPr>
-        <w:t>Regression :</w:t>
-      </w:r>
-      <w:proofErr w:type="gramEnd"/>
-      <w:r>
-        <w:rPr>
-          <w:lang w:val="en-US"/>
-        </w:rPr>
-        <w:t xml:space="preserve"> Its </w:t>
-      </w:r>
-      <w:proofErr w:type="spellStart"/>
-      <w:r>
-        <w:rPr>
-          <w:lang w:val="en-US"/>
-        </w:rPr>
-        <w:t>Continious</w:t>
-      </w:r>
-      <w:proofErr w:type="spellEnd"/>
-      <w:r>
-        <w:rPr>
-          <w:lang w:val="en-US"/>
-        </w:rPr>
-        <w:t xml:space="preserve"> </w:t>
+      <w:r>
+        <w:rPr>
+          <w:lang w:val="en-US"/>
+        </w:rPr>
+        <w:t xml:space="preserve">Regression : Its Continious </w:t>
       </w:r>
     </w:p>
     <w:p>
@@ -556,7 +436,6 @@
                 <w14:ligatures w14:val="none"/>
               </w:rPr>
             </w:pPr>
-            <w:proofErr w:type="spellStart"/>
             <w:r>
               <w:rPr>
                 <w:rFonts w:ascii="Aptos Narrow" w:eastAsia="Times New Roman" w:hAnsi="Aptos Narrow" w:cs="Times New Roman"/>
@@ -567,20 +446,7 @@
                 <w:lang w:eastAsia="en-IN"/>
                 <w14:ligatures w14:val="none"/>
               </w:rPr>
-              <w:t>Classififcation</w:t>
-            </w:r>
-            <w:proofErr w:type="spellEnd"/>
-            <w:r>
-              <w:rPr>
-                <w:rFonts w:ascii="Aptos Narrow" w:eastAsia="Times New Roman" w:hAnsi="Aptos Narrow" w:cs="Times New Roman"/>
-                <w:color w:val="000000"/>
-                <w:kern w:val="0"/>
-                <w:sz w:val="22"/>
-                <w:szCs w:val="22"/>
-                <w:lang w:eastAsia="en-IN"/>
-                <w14:ligatures w14:val="none"/>
-              </w:rPr>
-              <w:t xml:space="preserve"> Algos </w:t>
+              <w:t xml:space="preserve">Classififcation Algos </w:t>
             </w:r>
           </w:p>
         </w:tc>
@@ -790,7 +656,6 @@
                 <w14:ligatures w14:val="none"/>
               </w:rPr>
             </w:pPr>
-            <w:proofErr w:type="spellStart"/>
             <w:r>
               <w:rPr>
                 <w:rFonts w:ascii="Aptos Narrow" w:eastAsia="Times New Roman" w:hAnsi="Aptos Narrow" w:cs="Times New Roman"/>
@@ -801,20 +666,7 @@
                 <w:lang w:eastAsia="en-IN"/>
                 <w14:ligatures w14:val="none"/>
               </w:rPr>
-              <w:t>Decission</w:t>
-            </w:r>
-            <w:proofErr w:type="spellEnd"/>
-            <w:r>
-              <w:rPr>
-                <w:rFonts w:ascii="Aptos Narrow" w:eastAsia="Times New Roman" w:hAnsi="Aptos Narrow" w:cs="Times New Roman"/>
-                <w:color w:val="000000"/>
-                <w:kern w:val="0"/>
-                <w:sz w:val="22"/>
-                <w:szCs w:val="22"/>
-                <w:lang w:eastAsia="en-IN"/>
-                <w14:ligatures w14:val="none"/>
-              </w:rPr>
-              <w:t xml:space="preserve"> Tree--ML</w:t>
+              <w:t>Decission Tree--ML</w:t>
             </w:r>
           </w:p>
         </w:tc>
@@ -845,7 +697,6 @@
                 <w14:ligatures w14:val="none"/>
               </w:rPr>
             </w:pPr>
-            <w:proofErr w:type="spellStart"/>
             <w:r>
               <w:rPr>
                 <w:rFonts w:ascii="Aptos Narrow" w:eastAsia="Times New Roman" w:hAnsi="Aptos Narrow" w:cs="Times New Roman"/>
@@ -856,20 +707,7 @@
                 <w:lang w:eastAsia="en-IN"/>
                 <w14:ligatures w14:val="none"/>
               </w:rPr>
-              <w:t>Decission</w:t>
-            </w:r>
-            <w:proofErr w:type="spellEnd"/>
-            <w:r>
-              <w:rPr>
-                <w:rFonts w:ascii="Aptos Narrow" w:eastAsia="Times New Roman" w:hAnsi="Aptos Narrow" w:cs="Times New Roman"/>
-                <w:color w:val="000000"/>
-                <w:kern w:val="0"/>
-                <w:sz w:val="22"/>
-                <w:szCs w:val="22"/>
-                <w:lang w:eastAsia="en-IN"/>
-                <w14:ligatures w14:val="none"/>
-              </w:rPr>
-              <w:t xml:space="preserve"> Tree--ML</w:t>
+              <w:t>Decission Tree--ML</w:t>
             </w:r>
           </w:p>
         </w:tc>
@@ -1261,7 +1099,7 @@
     <w:p>
       <w:pPr>
         <w:rPr>
-          <w:lang w:val="en-US"/>
+          <w:rFonts w:ascii="Arial" w:hAnsi="Arial" w:cs="Arial"/>
         </w:rPr>
       </w:pPr>
       <w:r>
@@ -1280,30 +1118,66 @@
         <w:rPr>
           <w:rFonts w:ascii="Arial" w:hAnsi="Arial" w:cs="Arial"/>
         </w:rPr>
-        <w:t xml:space="preserve">Aim is to find </w:t>
-      </w:r>
-      <w:proofErr w:type="gramStart"/>
-      <w:r>
-        <w:rPr>
-          <w:rFonts w:ascii="Arial" w:hAnsi="Arial" w:cs="Arial"/>
-        </w:rPr>
-        <w:t>best</w:t>
-      </w:r>
-      <w:proofErr w:type="gramEnd"/>
-      <w:r>
-        <w:rPr>
-          <w:rFonts w:ascii="Arial" w:hAnsi="Arial" w:cs="Arial"/>
-        </w:rPr>
-        <w:t xml:space="preserve"> fit line with min error</w:t>
+        <w:t>Aim is to find best fit line with min error</w:t>
       </w:r>
     </w:p>
     <w:p>
+      <w:pPr>
+        <w:rPr>
+          <w:rFonts w:ascii="Arial" w:hAnsi="Arial" w:cs="Arial"/>
+        </w:rPr>
+      </w:pPr>
+    </w:p>
+    <w:p>
+      <w:pPr>
+        <w:rPr>
+          <w:rFonts w:ascii="Arial" w:hAnsi="Arial" w:cs="Arial"/>
+        </w:rPr>
+      </w:pPr>
+      <w:hyperlink r:id="rId5" w:history="1">
+        <w:r>
+          <w:rPr>
+            <w:rStyle w:val="Hyperlink"/>
+            <w:rFonts w:ascii="Arial" w:hAnsi="Arial" w:cs="Arial"/>
+          </w:rPr>
+          <w:t xml:space="preserve">   </w:t>
+        </w:r>
+        <w:r>
+          <w:rPr>
+            <w:rStyle w:val="Hyperlink"/>
+            <w:rFonts w:ascii="Arial" w:hAnsi="Arial" w:cs="Arial"/>
+          </w:rPr>
+          <w:t>Simple Linear Regression Algorithm</w:t>
+        </w:r>
+        <w:r>
+          <w:rPr>
+            <w:rStyle w:val="Hyperlink"/>
+            <w:rFonts w:ascii="Arial" w:hAnsi="Arial" w:cs="Arial"/>
+          </w:rPr>
+          <w:t xml:space="preserve"> and Gradient Descent</w:t>
+        </w:r>
+      </w:hyperlink>
+      <w:r>
+        <w:rPr>
+          <w:rFonts w:ascii="Arial" w:hAnsi="Arial" w:cs="Arial"/>
+        </w:rPr>
+        <w:t xml:space="preserve"> </w:t>
+      </w:r>
+      <w:r>
+        <w:rPr>
+          <w:rFonts w:ascii="Arial" w:hAnsi="Arial" w:cs="Arial"/>
+        </w:rPr>
+        <w:t xml:space="preserve">: </w:t>
+      </w:r>
+    </w:p>
+    <w:p>
       <w:r>
         <w:rPr>
           <w:b/>
           <w:bCs/>
           <w:lang w:val="en-US"/>
         </w:rPr>
+        <w:lastRenderedPageBreak/>
         <w:t>Residual Error</w:t>
       </w:r>
       <w:r>
@@ -1372,7 +1246,6 @@
         <w:rPr>
           <w:rFonts w:ascii="Arial" w:hAnsi="Arial" w:cs="Arial"/>
         </w:rPr>
-        <w:lastRenderedPageBreak/>
         <w:t>Represented</w:t>
       </w:r>
       <w:r>
@@ -1391,16 +1264,8 @@
         <w:rPr>
           <w:rFonts w:ascii="Arial" w:hAnsi="Arial" w:cs="Arial"/>
         </w:rPr>
-        <w:t>hat=</w:t>
-      </w:r>
-      <w:proofErr w:type="spellStart"/>
-      <w:r>
-        <w:rPr>
-          <w:rFonts w:ascii="Arial" w:hAnsi="Arial" w:cs="Arial"/>
-        </w:rPr>
-        <w:t>mx+c</w:t>
-      </w:r>
-      <w:proofErr w:type="spellEnd"/>
+        <w:t>hat=mx+c</w:t>
+      </w:r>
       <w:r>
         <w:rPr>
           <w:rFonts w:ascii="Arial" w:hAnsi="Arial" w:cs="Arial"/>
@@ -1455,16 +1320,412 @@
     <w:p>
       <w:pPr>
         <w:rPr>
-          <w:lang w:val="en-US"/>
-        </w:rPr>
-      </w:pPr>
+          <w:rFonts w:ascii="Arial" w:hAnsi="Arial" w:cs="Arial"/>
+        </w:rPr>
+      </w:pPr>
+      <w:r>
+        <w:rPr>
+          <w:noProof/>
+        </w:rPr>
+        <w:drawing>
+          <wp:anchor distT="0" distB="0" distL="114300" distR="114300" simplePos="0" relativeHeight="251658240" behindDoc="0" locked="0" layoutInCell="1" allowOverlap="1" wp14:anchorId="56BFEB64" wp14:editId="7C2B72DA">
+            <wp:simplePos x="0" y="0"/>
+            <wp:positionH relativeFrom="margin">
+              <wp:posOffset>-476250</wp:posOffset>
+            </wp:positionH>
+            <wp:positionV relativeFrom="paragraph">
+              <wp:posOffset>473075</wp:posOffset>
+            </wp:positionV>
+            <wp:extent cx="6854825" cy="4048125"/>
+            <wp:effectExtent l="0" t="0" r="3175" b="9525"/>
+            <wp:wrapSquare wrapText="bothSides"/>
+            <wp:docPr id="285166891" name="Picture 1" descr="A math formula with equations&#10;&#10;AI-generated content may be incorrect."/>
+            <wp:cNvGraphicFramePr>
+              <a:graphicFrameLocks xmlns:a="http://schemas.openxmlformats.org/drawingml/2006/main" noChangeAspect="1"/>
+            </wp:cNvGraphicFramePr>
+            <a:graphic xmlns:a="http://schemas.openxmlformats.org/drawingml/2006/main">
+              <a:graphicData uri="http://schemas.openxmlformats.org/drawingml/2006/picture">
+                <pic:pic xmlns:pic="http://schemas.openxmlformats.org/drawingml/2006/picture">
+                  <pic:nvPicPr>
+                    <pic:cNvPr id="285166891" name="Picture 1" descr="A math formula with equations&#10;&#10;AI-generated content may be incorrect."/>
+                    <pic:cNvPicPr/>
+                  </pic:nvPicPr>
+                  <pic:blipFill>
+                    <a:blip r:embed="rId6">
+                      <a:extLst>
+                        <a:ext uri="{28A0092B-C50C-407E-A947-70E740481C1C}">
+                          <a14:useLocalDpi xmlns:a14="http://schemas.microsoft.com/office/drawing/2010/main" val="0"/>
+                        </a:ext>
+                      </a:extLst>
+                    </a:blip>
+                    <a:stretch>
+                      <a:fillRect/>
+                    </a:stretch>
+                  </pic:blipFill>
+                  <pic:spPr>
+                    <a:xfrm>
+                      <a:off x="0" y="0"/>
+                      <a:ext cx="6854825" cy="4048125"/>
+                    </a:xfrm>
+                    <a:prstGeom prst="rect">
+                      <a:avLst/>
+                    </a:prstGeom>
+                  </pic:spPr>
+                </pic:pic>
+              </a:graphicData>
+            </a:graphic>
+            <wp14:sizeRelH relativeFrom="margin">
+              <wp14:pctWidth>0</wp14:pctWidth>
+            </wp14:sizeRelH>
+            <wp14:sizeRelV relativeFrom="margin">
+              <wp14:pctHeight>0</wp14:pctHeight>
+            </wp14:sizeRelV>
+          </wp:anchor>
+        </w:drawing>
+      </w:r>
+      <w:r>
+        <w:rPr>
+          <w:rFonts w:ascii="Arial" w:hAnsi="Arial" w:cs="Arial"/>
+          <w:b/>
+          <w:bCs/>
+        </w:rPr>
+        <w:t>Cost Function</w:t>
+      </w:r>
+      <w:r>
+        <w:rPr>
+          <w:rFonts w:ascii="Arial" w:hAnsi="Arial" w:cs="Arial"/>
+          <w:b/>
+          <w:bCs/>
+        </w:rPr>
+        <w:t xml:space="preserve"> or Squared Error Function </w:t>
+      </w:r>
+      <w:r>
+        <w:rPr>
+          <w:rFonts w:ascii="Arial" w:hAnsi="Arial" w:cs="Arial"/>
+          <w:b/>
+          <w:bCs/>
+        </w:rPr>
+        <w:t xml:space="preserve"> or Mean Squared Error</w:t>
+      </w:r>
+      <w:r>
+        <w:rPr>
+          <w:rFonts w:ascii="Arial" w:hAnsi="Arial" w:cs="Arial"/>
+        </w:rPr>
+        <w:t xml:space="preserve"> </w:t>
+      </w:r>
+      <w:r>
+        <w:rPr>
+          <w:rFonts w:ascii="Arial" w:hAnsi="Arial" w:cs="Arial"/>
+        </w:rPr>
+        <w:t xml:space="preserve">: </w:t>
+      </w:r>
+      <w:r>
+        <w:rPr>
+          <w:rFonts w:ascii="Arial" w:hAnsi="Arial" w:cs="Arial"/>
+        </w:rPr>
+        <w:t xml:space="preserve">Minimize  </w:t>
+      </w:r>
+      <w:r>
+        <w:rPr>
+          <w:rFonts w:ascii="Arial" w:hAnsi="Arial" w:cs="Arial"/>
+        </w:rPr>
+        <w:t>difference</w:t>
+      </w:r>
+      <w:r>
+        <w:rPr>
+          <w:rFonts w:ascii="Arial" w:hAnsi="Arial" w:cs="Arial"/>
+        </w:rPr>
+        <w:t xml:space="preserve"> between predicted value</w:t>
+      </w:r>
+      <w:r>
+        <w:rPr>
+          <w:rFonts w:ascii="Arial" w:hAnsi="Arial" w:cs="Arial"/>
+        </w:rPr>
+        <w:t>(y^)</w:t>
+      </w:r>
+      <w:r>
+        <w:rPr>
+          <w:rFonts w:ascii="Arial" w:hAnsi="Arial" w:cs="Arial"/>
+        </w:rPr>
+        <w:t xml:space="preserve"> and actual value</w:t>
+      </w:r>
+      <w:r>
+        <w:rPr>
+          <w:rFonts w:ascii="Arial" w:hAnsi="Arial" w:cs="Arial"/>
+        </w:rPr>
+        <w:t>(y)</w:t>
+      </w:r>
+      <w:r>
+        <w:rPr>
+          <w:rFonts w:ascii="Arial" w:hAnsi="Arial" w:cs="Arial"/>
+        </w:rPr>
+        <w:sym w:font="Wingdings" w:char="F0E8"/>
+      </w:r>
+      <w:r>
+        <w:rPr>
+          <w:rFonts w:ascii="Arial" w:hAnsi="Arial" w:cs="Arial"/>
+        </w:rPr>
+        <w:t>[</w:t>
+      </w:r>
+      <w:r>
+        <w:rPr>
+          <w:rFonts w:ascii="Arial" w:hAnsi="Arial" w:cs="Arial"/>
+        </w:rPr>
+        <w:t>y^</w:t>
+      </w:r>
+      <w:r>
+        <w:rPr>
+          <w:rFonts w:ascii="Arial" w:hAnsi="Arial" w:cs="Arial"/>
+        </w:rPr>
+        <w:t>-y</w:t>
+      </w:r>
+      <w:r>
+        <w:rPr>
+          <w:rFonts w:ascii="Arial" w:hAnsi="Arial" w:cs="Arial"/>
+        </w:rPr>
+        <w:t>]</w:t>
+      </w:r>
     </w:p>
     <w:p>
       <w:pPr>
         <w:rPr>
-          <w:lang w:val="en-US"/>
-        </w:rPr>
-      </w:pPr>
+          <w:rFonts w:ascii="Arial" w:hAnsi="Arial" w:cs="Arial"/>
+        </w:rPr>
+      </w:pPr>
+    </w:p>
+    <w:p>
+      <w:pPr>
+        <w:pStyle w:val="ListParagraph"/>
+        <w:numPr>
+          <w:ilvl w:val="0"/>
+          <w:numId w:val="1"/>
+        </w:numPr>
+        <w:rPr>
+          <w:rFonts w:ascii="Arial" w:hAnsi="Arial" w:cs="Arial"/>
+        </w:rPr>
+      </w:pPr>
+      <w:r>
+        <w:rPr>
+          <w:rFonts w:ascii="Arial" w:hAnsi="Arial" w:cs="Arial"/>
+        </w:rPr>
+        <w:t>When we calculate best fit line for different x and y values for above cost function we get a curve.</w:t>
+      </w:r>
+      <w:r>
+        <w:rPr>
+          <w:rFonts w:ascii="Arial" w:hAnsi="Arial" w:cs="Arial"/>
+        </w:rPr>
+        <w:t xml:space="preserve"> </w:t>
+      </w:r>
+      <w:r>
+        <w:rPr>
+          <w:rFonts w:ascii="Arial" w:hAnsi="Arial" w:cs="Arial"/>
+        </w:rPr>
+        <w:t xml:space="preserve">This curve is called Gradient descent. (optimizer) </w:t>
+      </w:r>
+      <w:r>
+        <w:rPr>
+          <w:rFonts w:ascii="Arial" w:hAnsi="Arial" w:cs="Arial"/>
+        </w:rPr>
+        <w:t>.</w:t>
+      </w:r>
+    </w:p>
+    <w:p>
+      <w:pPr>
+        <w:pStyle w:val="ListParagraph"/>
+        <w:numPr>
+          <w:ilvl w:val="0"/>
+          <w:numId w:val="1"/>
+        </w:numPr>
+        <w:rPr>
+          <w:rFonts w:ascii="Arial" w:hAnsi="Arial" w:cs="Arial"/>
+        </w:rPr>
+      </w:pPr>
+      <w:r>
+        <w:rPr>
+          <w:rFonts w:ascii="Arial" w:hAnsi="Arial" w:cs="Arial"/>
+        </w:rPr>
+        <w:t>D</w:t>
+      </w:r>
+      <w:r>
+        <w:rPr>
+          <w:rFonts w:ascii="Arial" w:hAnsi="Arial" w:cs="Arial"/>
+        </w:rPr>
+        <w:t>o</w:t>
+      </w:r>
+      <w:r>
+        <w:rPr>
+          <w:rFonts w:ascii="Arial" w:hAnsi="Arial" w:cs="Arial"/>
+        </w:rPr>
+        <w:t xml:space="preserve"> the </w:t>
+      </w:r>
+      <w:r>
+        <w:rPr>
+          <w:rFonts w:ascii="Arial" w:hAnsi="Arial" w:cs="Arial"/>
+        </w:rPr>
+        <w:t>process</w:t>
+      </w:r>
+      <w:r>
+        <w:rPr>
+          <w:rFonts w:ascii="Arial" w:hAnsi="Arial" w:cs="Arial"/>
+        </w:rPr>
+        <w:t xml:space="preserve"> till we get Global minima</w:t>
+      </w:r>
+      <w:r>
+        <w:rPr>
+          <w:rFonts w:ascii="Arial" w:hAnsi="Arial" w:cs="Arial"/>
+        </w:rPr>
+        <w:t xml:space="preserve"> is reached </w:t>
+      </w:r>
+      <w:r>
+        <w:rPr>
+          <w:rFonts w:ascii="Arial" w:hAnsi="Arial" w:cs="Arial"/>
+        </w:rPr>
+        <w:t>.</w:t>
+      </w:r>
+      <w:r>
+        <w:rPr>
+          <w:rFonts w:ascii="Arial" w:hAnsi="Arial" w:cs="Arial"/>
+          <w:b/>
+          <w:bCs/>
+        </w:rPr>
+        <w:t>Global Minima</w:t>
+      </w:r>
+      <w:r>
+        <w:rPr>
+          <w:rFonts w:ascii="Arial" w:hAnsi="Arial" w:cs="Arial"/>
+        </w:rPr>
+        <w:t xml:space="preserve"> is the place where u have min diff btw predicted and actual</w:t>
+      </w:r>
+      <w:r>
+        <w:rPr>
+          <w:rFonts w:ascii="Arial" w:hAnsi="Arial" w:cs="Arial"/>
+        </w:rPr>
+        <w:t xml:space="preserve"> </w:t>
+      </w:r>
+      <w:r>
+        <w:rPr>
+          <w:rFonts w:ascii="Arial" w:hAnsi="Arial" w:cs="Arial"/>
+        </w:rPr>
+        <w:t>values.</w:t>
+      </w:r>
+      <w:r>
+        <w:rPr>
+          <w:rFonts w:ascii="Arial" w:hAnsi="Arial" w:cs="Arial"/>
+        </w:rPr>
+        <w:t xml:space="preserve"> </w:t>
+      </w:r>
+    </w:p>
+    <w:p>
+      <w:pPr>
+        <w:pStyle w:val="ListParagraph"/>
+        <w:numPr>
+          <w:ilvl w:val="0"/>
+          <w:numId w:val="1"/>
+        </w:numPr>
+        <w:rPr>
+          <w:rFonts w:ascii="Arial" w:hAnsi="Arial" w:cs="Arial"/>
+        </w:rPr>
+      </w:pPr>
+      <w:r>
+        <w:rPr>
+          <w:rFonts w:ascii="Arial" w:hAnsi="Arial" w:cs="Arial"/>
+          <w:b/>
+          <w:bCs/>
+        </w:rPr>
+        <w:t xml:space="preserve">Repeat </w:t>
+      </w:r>
+      <w:r>
+        <w:rPr>
+          <w:rFonts w:ascii="Arial" w:hAnsi="Arial" w:cs="Arial"/>
+          <w:b/>
+          <w:bCs/>
+        </w:rPr>
+        <w:t>Convergence</w:t>
+      </w:r>
+      <w:r>
+        <w:rPr>
+          <w:rFonts w:ascii="Arial" w:hAnsi="Arial" w:cs="Arial"/>
+          <w:b/>
+          <w:bCs/>
+        </w:rPr>
+        <w:t xml:space="preserve"> Theorem</w:t>
+      </w:r>
+      <w:r>
+        <w:rPr>
+          <w:rFonts w:ascii="Arial" w:hAnsi="Arial" w:cs="Arial"/>
+        </w:rPr>
+        <w:t>: This is used to understand how to change the theeta1 value to reac</w:t>
+      </w:r>
+      <w:r>
+        <w:rPr>
+          <w:rFonts w:ascii="Arial" w:hAnsi="Arial" w:cs="Arial"/>
+        </w:rPr>
+        <w:t xml:space="preserve">h  </w:t>
+      </w:r>
+      <w:r>
+        <w:rPr>
+          <w:rFonts w:ascii="Arial" w:hAnsi="Arial" w:cs="Arial"/>
+        </w:rPr>
+        <w:t xml:space="preserve"> global minima.</w:t>
+      </w:r>
+      <w:r>
+        <w:rPr>
+          <w:rFonts w:ascii="Arial" w:hAnsi="Arial" w:cs="Arial"/>
+        </w:rPr>
+        <w:t xml:space="preserve"> </w:t>
+      </w:r>
+    </w:p>
+    <w:p>
+      <w:pPr>
+        <w:pStyle w:val="ListParagraph"/>
+        <w:numPr>
+          <w:ilvl w:val="0"/>
+          <w:numId w:val="1"/>
+        </w:numPr>
+        <w:rPr>
+          <w:lang w:val="en-US"/>
+        </w:rPr>
+      </w:pPr>
+      <w:r>
+        <w:rPr>
+          <w:rFonts w:ascii="Arial" w:hAnsi="Arial" w:cs="Arial"/>
+          <w:b/>
+          <w:bCs/>
+        </w:rPr>
+        <w:t xml:space="preserve">Learning Rate : </w:t>
+      </w:r>
+      <w:r>
+        <w:rPr>
+          <w:rFonts w:ascii="Arial" w:hAnsi="Arial" w:cs="Arial"/>
+        </w:rPr>
+        <w:t>The rate at which the</w:t>
+      </w:r>
+      <w:r>
+        <w:rPr>
+          <w:rFonts w:ascii="Arial" w:hAnsi="Arial" w:cs="Arial"/>
+          <w:b/>
+          <w:bCs/>
+        </w:rPr>
+        <w:t xml:space="preserve"> </w:t>
+      </w:r>
+      <w:r>
+        <w:rPr>
+          <w:rFonts w:ascii="Arial" w:hAnsi="Arial" w:cs="Arial"/>
+        </w:rPr>
+        <w:t>machine learns to reach global minima</w:t>
+      </w:r>
+      <w:r>
+        <w:rPr>
+          <w:rFonts w:ascii="Arial" w:hAnsi="Arial" w:cs="Arial"/>
+        </w:rPr>
+        <w:t xml:space="preserve"> denoted by alpha</w:t>
+      </w:r>
+      <w:r>
+        <w:rPr>
+          <w:rFonts w:ascii="Arial" w:hAnsi="Arial" w:cs="Arial"/>
+        </w:rPr>
+        <w:t>.</w:t>
+      </w:r>
     </w:p>
     <w:p>
       <w:pPr>
@@ -1481,6 +1742,127 @@
     </w:sectPr>
   </w:body>
 </w:document>
+</file>
+
+<file path=word/numbering.xml><?xml version="1.0" encoding="utf-8"?>
+<w:numbering xmlns:wpc="http://schemas.microsoft.com/office/word/2010/wordprocessingCanvas" xmlns:cx="http://schemas.microsoft.com/office/drawing/2014/chartex" xmlns:cx1="http://schemas.microsoft.com/office/drawing/2015/9/8/chartex" xmlns:cx2="http://schemas.microsoft.com/office/drawing/2015/10/21/chartex" xmlns:cx3="http://schemas.microsoft.com/office/drawing/2016/5/9/chartex" xmlns:cx4="http://schemas.microsoft.com/office/drawing/2016/5/10/chartex" xmlns:cx5="http://schemas.microsoft.com/office/drawing/2016/5/11/chartex" xmlns:cx6="http://schemas.microsoft.com/office/drawing/2016/5/12/chartex" xmlns:cx7="http://schemas.microsoft.com/office/drawing/2016/5/13/chartex" xmlns:cx8="http://schemas.microsoft.com/office/drawing/2016/5/14/chartex" xmlns:mc="http://schemas.openxmlformats.org/markup-compatibility/2006" xmlns:aink="http://schemas.microsoft.com/office/drawing/2016/ink" xmlns:am3d="http://schemas.microsoft.com/office/drawing/2017/model3d" xmlns:o="urn:schemas-microsoft-com:office:office" xmlns:oel="http://schemas.microsoft.com/office/2019/extlst" xmlns:r="http://schemas.openxmlformats.org/officeDocument/2006/relationships" xmlns:m="http://schemas.openxmlformats.org/officeDocument/2006/math" xmlns:v="urn:schemas-microsoft-com:vml" xmlns:wp14="http://schemas.microsoft.com/office/word/2010/wordprocessingDrawing" xmlns:wp="http://schemas.openxmlformats.org/drawingml/2006/wordprocessingDrawing" xmlns:w10="urn:schemas-microsoft-com:office:word" xmlns:w="http://schemas.openxmlformats.org/wordprocessingml/2006/main" xmlns:w14="http://schemas.microsoft.com/office/word/2010/wordml" xmlns:w15="http://schemas.microsoft.com/office/word/2012/wordml" xmlns:w16cex="http://schemas.microsoft.com/office/word/2018/wordml/cex" xmlns:w16cid="http://schemas.microsoft.com/office/word/2016/wordml/cid" xmlns:w16="http://schemas.microsoft.com/office/word/2018/wordml" xmlns:w16du="http://schemas.microsoft.com/office/word/2023/wordml/word16du" xmlns:w16sdtdh="http://schemas.microsoft.com/office/word/2020/wordml/sdtdatahash" xmlns:w16sdtfl="http://schemas.microsoft.com/office/word/2024/wordml/sdtformatlock" xmlns:w16se="http://schemas.microsoft.com/office/word/2015/wordml/symex" xmlns:wpg="http://schemas.microsoft.com/office/word/2010/wordprocessingGroup" xmlns:wpi="http://schemas.microsoft.com/office/word/2010/wordprocessingInk" xmlns:wne="http://schemas.microsoft.com/office/word/2006/wordml" xmlns:wps="http://schemas.microsoft.com/office/word/2010/wordprocessingShape" mc:Ignorable="w14 w15 w16se w16cid w16 w16cex w16sdtdh w16sdtfl w16du wp14">
+  <w:abstractNum w:abstractNumId="0" w15:restartNumberingAfterBreak="0">
+    <w:nsid w:val="10C21010"/>
+    <w:multiLevelType w:val="hybridMultilevel"/>
+    <w:tmpl w:val="B3CC1AAA"/>
+    <w:lvl w:ilvl="0" w:tplc="40090001">
+      <w:start w:val="1"/>
+      <w:numFmt w:val="bullet"/>
+      <w:lvlText w:val=""/>
+      <w:lvlJc w:val="left"/>
+      <w:pPr>
+        <w:ind w:left="720" w:hanging="360"/>
+      </w:pPr>
+      <w:rPr>
+        <w:rFonts w:ascii="Symbol" w:hAnsi="Symbol" w:hint="default"/>
+      </w:rPr>
+    </w:lvl>
+    <w:lvl w:ilvl="1" w:tplc="40090003" w:tentative="1">
+      <w:start w:val="1"/>
+      <w:numFmt w:val="bullet"/>
+      <w:lvlText w:val="o"/>
+      <w:lvlJc w:val="left"/>
+      <w:pPr>
+        <w:ind w:left="1440" w:hanging="360"/>
+      </w:pPr>
+      <w:rPr>
+        <w:rFonts w:ascii="Courier New" w:hAnsi="Courier New" w:cs="Courier New" w:hint="default"/>
+      </w:rPr>
+    </w:lvl>
+    <w:lvl w:ilvl="2" w:tplc="40090005" w:tentative="1">
+      <w:start w:val="1"/>
+      <w:numFmt w:val="bullet"/>
+      <w:lvlText w:val=""/>
+      <w:lvlJc w:val="left"/>
+      <w:pPr>
+        <w:ind w:left="2160" w:hanging="360"/>
+      </w:pPr>
+      <w:rPr>
+        <w:rFonts w:ascii="Wingdings" w:hAnsi="Wingdings" w:hint="default"/>
+      </w:rPr>
+    </w:lvl>
+    <w:lvl w:ilvl="3" w:tplc="40090001" w:tentative="1">
+      <w:start w:val="1"/>
+      <w:numFmt w:val="bullet"/>
+      <w:lvlText w:val=""/>
+      <w:lvlJc w:val="left"/>
+      <w:pPr>
+        <w:ind w:left="2880" w:hanging="360"/>
+      </w:pPr>
+      <w:rPr>
+        <w:rFonts w:ascii="Symbol" w:hAnsi="Symbol" w:hint="default"/>
+      </w:rPr>
+    </w:lvl>
+    <w:lvl w:ilvl="4" w:tplc="40090003" w:tentative="1">
+      <w:start w:val="1"/>
+      <w:numFmt w:val="bullet"/>
+      <w:lvlText w:val="o"/>
+      <w:lvlJc w:val="left"/>
+      <w:pPr>
+        <w:ind w:left="3600" w:hanging="360"/>
+      </w:pPr>
+      <w:rPr>
+        <w:rFonts w:ascii="Courier New" w:hAnsi="Courier New" w:cs="Courier New" w:hint="default"/>
+      </w:rPr>
+    </w:lvl>
+    <w:lvl w:ilvl="5" w:tplc="40090005" w:tentative="1">
+      <w:start w:val="1"/>
+      <w:numFmt w:val="bullet"/>
+      <w:lvlText w:val=""/>
+      <w:lvlJc w:val="left"/>
+      <w:pPr>
+        <w:ind w:left="4320" w:hanging="360"/>
+      </w:pPr>
+      <w:rPr>
+        <w:rFonts w:ascii="Wingdings" w:hAnsi="Wingdings" w:hint="default"/>
+      </w:rPr>
+    </w:lvl>
+    <w:lvl w:ilvl="6" w:tplc="40090001" w:tentative="1">
+      <w:start w:val="1"/>
+      <w:numFmt w:val="bullet"/>
+      <w:lvlText w:val=""/>
+      <w:lvlJc w:val="left"/>
+      <w:pPr>
+        <w:ind w:left="5040" w:hanging="360"/>
+      </w:pPr>
+      <w:rPr>
+        <w:rFonts w:ascii="Symbol" w:hAnsi="Symbol" w:hint="default"/>
+      </w:rPr>
+    </w:lvl>
+    <w:lvl w:ilvl="7" w:tplc="40090003" w:tentative="1">
+      <w:start w:val="1"/>
+      <w:numFmt w:val="bullet"/>
+      <w:lvlText w:val="o"/>
+      <w:lvlJc w:val="left"/>
+      <w:pPr>
+        <w:ind w:left="5760" w:hanging="360"/>
+      </w:pPr>
+      <w:rPr>
+        <w:rFonts w:ascii="Courier New" w:hAnsi="Courier New" w:cs="Courier New" w:hint="default"/>
+      </w:rPr>
+    </w:lvl>
+    <w:lvl w:ilvl="8" w:tplc="40090005" w:tentative="1">
+      <w:start w:val="1"/>
+      <w:numFmt w:val="bullet"/>
+      <w:lvlText w:val=""/>
+      <w:lvlJc w:val="left"/>
+      <w:pPr>
+        <w:ind w:left="6480" w:hanging="360"/>
+      </w:pPr>
+      <w:rPr>
+        <w:rFonts w:ascii="Wingdings" w:hAnsi="Wingdings" w:hint="default"/>
+      </w:rPr>
+    </w:lvl>
+  </w:abstractNum>
+  <w:num w:numId="1" w16cid:durableId="2121412300">
+    <w:abstractNumId w:val="0"/>
+  </w:num>
+</w:numbering>
 </file>
 
 <file path=word/styles.xml><?xml version="1.0" encoding="utf-8"?>
@@ -2085,6 +2467,7 @@
   <w:style w:type="character" w:default="1" w:styleId="DefaultParagraphFont">
     <w:name w:val="Default Paragraph Font"/>
     <w:uiPriority w:val="1"/>
+    <w:semiHidden/>
     <w:unhideWhenUsed/>
   </w:style>
   <w:style w:type="table" w:default="1" w:styleId="TableNormal">
@@ -2395,6 +2778,29 @@
       <w:smallCaps/>
       <w:color w:val="0F4761" w:themeColor="accent1" w:themeShade="BF"/>
       <w:spacing w:val="5"/>
+    </w:rPr>
+  </w:style>
+  <w:style w:type="character" w:styleId="Hyperlink">
+    <w:name w:val="Hyperlink"/>
+    <w:basedOn w:val="DefaultParagraphFont"/>
+    <w:uiPriority w:val="99"/>
+    <w:unhideWhenUsed/>
+    <w:rsid w:val="00113F36"/>
+    <w:rPr>
+      <w:color w:val="467886" w:themeColor="hyperlink"/>
+      <w:u w:val="single"/>
+    </w:rPr>
+  </w:style>
+  <w:style w:type="character" w:styleId="UnresolvedMention">
+    <w:name w:val="Unresolved Mention"/>
+    <w:basedOn w:val="DefaultParagraphFont"/>
+    <w:uiPriority w:val="99"/>
+    <w:semiHidden/>
+    <w:unhideWhenUsed/>
+    <w:rsid w:val="00113F36"/>
+    <w:rPr>
+      <w:color w:val="605E5C"/>
+      <w:shd w:val="clear" w:color="auto" w:fill="E1DFDD"/>
     </w:rPr>
   </w:style>
 </w:styles>

</xml_diff>